<commit_message>
Labs 7 and 8, lab1 and lab2 folders, reports for every lab
</commit_message>
<xml_diff>
--- a/lab6/Lab5-6_IonMorosanu_FAF-242.docx
+++ b/lab6/Lab5-6_IonMorosanu_FAF-242.docx
@@ -220,24 +220,6 @@
           <w:lang w:val="en-GB" w:bidi="th-TH"/>
         </w:rPr>
       </w:pPr>
-      <w:r>
-        <w:rPr>
-          <w:b/>
-          <w:sz w:val="32"/>
-          <w:szCs w:val="32"/>
-          <w:lang w:val="en-GB" w:bidi="th-TH"/>
-        </w:rPr>
-        <w:t>Ion Moroșanu</w:t>
-      </w:r>
-      <w:r>
-        <w:rPr>
-          <w:b/>
-          <w:sz w:val="32"/>
-          <w:szCs w:val="32"/>
-          <w:lang w:val="en-GB" w:bidi="th-TH"/>
-        </w:rPr>
-        <w:t xml:space="preserve"> FAF-242</w:t>
-      </w:r>
     </w:p>
     <w:p>
       <w:pPr>
@@ -310,14 +292,10 @@
       </w:pPr>
       <w:r>
         <w:rPr>
-          <w:bCs/>
           <w:i/>
-          <w:iCs/>
           <w:sz w:val="40"/>
-          <w:szCs w:val="40"/>
-          <w:lang w:val="en-GB" w:bidi="th-TH"/>
-        </w:rPr>
-        <w:t>Laboratory Works no. 5 and 6</w:t>
+        </w:rPr>
+        <w:t>on Laboratory Works no. 5 and 6</w:t>
       </w:r>
     </w:p>
     <w:p>
@@ -344,6 +322,19 @@
           <w:lang w:val="en-GB" w:bidi="th-TH"/>
         </w:rPr>
       </w:pPr>
+      <w:r>
+        <w:rPr>
+          <w:b/>
+          <w:sz w:val="28"/>
+        </w:rPr>
+        <w:t xml:space="preserve">Theme: </w:t>
+      </w:r>
+      <w:r>
+        <w:rPr>
+          <w:sz w:val="28"/>
+        </w:rPr>
+        <w:t>The File System with Your Own Hands (Linux) and Inside the xv6 File System</w:t>
+      </w:r>
     </w:p>
     <w:p>
       <w:pPr>
@@ -423,11 +414,16 @@
       </w:pPr>
       <w:r>
         <w:rPr>
-          <w:sz w:val="30"/>
-          <w:szCs w:val="30"/>
-          <w:lang w:val="en-GB"/>
-        </w:rPr>
-        <w:t>Checked by:</w:t>
+          <w:sz w:val="28"/>
+        </w:rPr>
+        <w:t xml:space="preserve">Done by: st. gr. FAF-242, </w:t>
+      </w:r>
+      <w:r>
+        <w:rPr>
+          <w:b/>
+          <w:sz w:val="28"/>
+        </w:rPr>
+        <w:t>Moroșanu Ion</w:t>
       </w:r>
     </w:p>
     <w:p>
@@ -444,42 +440,23 @@
       </w:pPr>
       <w:r>
         <w:rPr>
+          <w:sz w:val="28"/>
+        </w:rPr>
+        <w:t xml:space="preserve">Checked by: </w:t>
+      </w:r>
+      <w:r>
+        <w:rPr>
           <w:b/>
-          <w:bCs/>
           <w:sz w:val="28"/>
-          <w:szCs w:val="28"/>
-          <w:lang w:val="en-GB" w:bidi="th-TH"/>
-        </w:rPr>
-        <w:t>Rei</w:t>
-      </w:r>
-      <w:r>
-        <w:rPr>
-          <w:rStyle w:val="Strong"/>
-          <w:rFonts w:ascii="Google Sans;sans-serif" w:hAnsi="Google Sans;sans-serif"/>
-          <w:szCs w:val="28"/>
-          <w:lang w:val="en-GB" w:bidi="th-TH"/>
-        </w:rPr>
-        <w:t>ț</w:t>
-      </w:r>
-      <w:r>
-        <w:rPr>
-          <w:b/>
-          <w:bCs/>
+        </w:rPr>
+        <w:t>Reițman Patricia</w:t>
+      </w:r>
+      <w:r>
+        <w:rPr>
+          <w:i/>
           <w:sz w:val="28"/>
-          <w:szCs w:val="28"/>
-          <w:lang w:val="en-GB" w:bidi="th-TH"/>
-        </w:rPr>
-        <w:t xml:space="preserve">man Patricia, </w:t>
-      </w:r>
-      <w:r>
-        <w:rPr>
-          <w:i/>
-          <w:iCs/>
-          <w:sz w:val="28"/>
-          <w:szCs w:val="28"/>
-          <w:lang w:val="en-GB" w:bidi="th-TH"/>
-        </w:rPr>
-        <w:t>university assistant</w:t>
+        </w:rPr>
+        <w:t>, university assistant</w:t>
       </w:r>
     </w:p>
     <w:p>
@@ -695,7 +672,7 @@
         <w:rPr>
           <w:noProof/>
         </w:rPr>
-        <w:instrText xml:space="preserve"> PAGEREF _Toc242734349 \h </w:instrText>
+        <w:instrText xml:space="preserve"> PAGEREF _Toc243848948 \h </w:instrText>
       </w:r>
       <w:r>
         <w:rPr>
@@ -757,7 +734,7 @@
         <w:rPr>
           <w:noProof/>
         </w:rPr>
-        <w:instrText xml:space="preserve"> PAGEREF _Toc242734350 \h </w:instrText>
+        <w:instrText xml:space="preserve"> PAGEREF _Toc243848949 \h </w:instrText>
       </w:r>
       <w:r>
         <w:rPr>
@@ -818,7 +795,7 @@
         <w:rPr>
           <w:noProof/>
         </w:rPr>
-        <w:instrText xml:space="preserve"> PAGEREF _Toc242734351 \h </w:instrText>
+        <w:instrText xml:space="preserve"> PAGEREF _Toc243848950 \h </w:instrText>
       </w:r>
       <w:r>
         <w:rPr>
@@ -880,7 +857,7 @@
         <w:rPr>
           <w:noProof/>
         </w:rPr>
-        <w:instrText xml:space="preserve"> PAGEREF _Toc242734352 \h </w:instrText>
+        <w:instrText xml:space="preserve"> PAGEREF _Toc243848951 \h </w:instrText>
       </w:r>
       <w:r>
         <w:rPr>
@@ -942,7 +919,7 @@
         <w:rPr>
           <w:noProof/>
         </w:rPr>
-        <w:instrText xml:space="preserve"> PAGEREF _Toc242734353 \h </w:instrText>
+        <w:instrText xml:space="preserve"> PAGEREF _Toc243848952 \h </w:instrText>
       </w:r>
       <w:r>
         <w:rPr>
@@ -1004,7 +981,7 @@
         <w:rPr>
           <w:noProof/>
         </w:rPr>
-        <w:instrText xml:space="preserve"> PAGEREF _Toc242734354 \h </w:instrText>
+        <w:instrText xml:space="preserve"> PAGEREF _Toc243848953 \h </w:instrText>
       </w:r>
       <w:r>
         <w:rPr>
@@ -1066,7 +1043,7 @@
         <w:rPr>
           <w:noProof/>
         </w:rPr>
-        <w:instrText xml:space="preserve"> PAGEREF _Toc242734355 \h </w:instrText>
+        <w:instrText xml:space="preserve"> PAGEREF _Toc243848954 \h </w:instrText>
       </w:r>
       <w:r>
         <w:rPr>
@@ -1128,7 +1105,7 @@
         <w:rPr>
           <w:noProof/>
         </w:rPr>
-        <w:instrText xml:space="preserve"> PAGEREF _Toc242734356 \h </w:instrText>
+        <w:instrText xml:space="preserve"> PAGEREF _Toc243848955 \h </w:instrText>
       </w:r>
       <w:r>
         <w:rPr>
@@ -1190,7 +1167,7 @@
         <w:rPr>
           <w:noProof/>
         </w:rPr>
-        <w:instrText xml:space="preserve"> PAGEREF _Toc242734357 \h </w:instrText>
+        <w:instrText xml:space="preserve"> PAGEREF _Toc243848956 \h </w:instrText>
       </w:r>
       <w:r>
         <w:rPr>
@@ -1252,7 +1229,7 @@
         <w:rPr>
           <w:noProof/>
         </w:rPr>
-        <w:instrText xml:space="preserve"> PAGEREF _Toc242734358 \h </w:instrText>
+        <w:instrText xml:space="preserve"> PAGEREF _Toc243848957 \h </w:instrText>
       </w:r>
       <w:r>
         <w:rPr>
@@ -1314,7 +1291,7 @@
         <w:rPr>
           <w:noProof/>
         </w:rPr>
-        <w:instrText xml:space="preserve"> PAGEREF _Toc242734359 \h </w:instrText>
+        <w:instrText xml:space="preserve"> PAGEREF _Toc243848958 \h </w:instrText>
       </w:r>
       <w:r>
         <w:rPr>
@@ -1375,7 +1352,7 @@
         <w:rPr>
           <w:noProof/>
         </w:rPr>
-        <w:instrText xml:space="preserve"> PAGEREF _Toc242734360 \h </w:instrText>
+        <w:instrText xml:space="preserve"> PAGEREF _Toc243848959 \h </w:instrText>
       </w:r>
       <w:r>
         <w:rPr>
@@ -1437,7 +1414,7 @@
         <w:rPr>
           <w:noProof/>
         </w:rPr>
-        <w:instrText xml:space="preserve"> PAGEREF _Toc242734361 \h </w:instrText>
+        <w:instrText xml:space="preserve"> PAGEREF _Toc243848960 \h </w:instrText>
       </w:r>
       <w:r>
         <w:rPr>
@@ -1499,7 +1476,7 @@
         <w:rPr>
           <w:noProof/>
         </w:rPr>
-        <w:instrText xml:space="preserve"> PAGEREF _Toc242734362 \h </w:instrText>
+        <w:instrText xml:space="preserve"> PAGEREF _Toc243848961 \h </w:instrText>
       </w:r>
       <w:r>
         <w:rPr>
@@ -1561,7 +1538,7 @@
         <w:rPr>
           <w:noProof/>
         </w:rPr>
-        <w:instrText xml:space="preserve"> PAGEREF _Toc242734363 \h </w:instrText>
+        <w:instrText xml:space="preserve"> PAGEREF _Toc243848962 \h </w:instrText>
       </w:r>
       <w:r>
         <w:rPr>
@@ -1623,7 +1600,7 @@
         <w:rPr>
           <w:noProof/>
         </w:rPr>
-        <w:instrText xml:space="preserve"> PAGEREF _Toc242734364 \h </w:instrText>
+        <w:instrText xml:space="preserve"> PAGEREF _Toc243848963 \h </w:instrText>
       </w:r>
       <w:r>
         <w:rPr>
@@ -1684,7 +1661,7 @@
         <w:rPr>
           <w:noProof/>
         </w:rPr>
-        <w:instrText xml:space="preserve"> PAGEREF _Toc242734365 \h </w:instrText>
+        <w:instrText xml:space="preserve"> PAGEREF _Toc243848964 \h </w:instrText>
       </w:r>
       <w:r>
         <w:rPr>
@@ -1745,7 +1722,7 @@
         <w:rPr>
           <w:noProof/>
         </w:rPr>
-        <w:instrText xml:space="preserve"> PAGEREF _Toc242734366 \h </w:instrText>
+        <w:instrText xml:space="preserve"> PAGEREF _Toc243848965 \h </w:instrText>
       </w:r>
       <w:r>
         <w:rPr>
@@ -1784,7 +1761,7 @@
       <w:pPr>
         <w:pStyle w:val="Heading1"/>
       </w:pPr>
-      <w:bookmarkStart w:id="0" w:name="_Toc242734349"/>
+      <w:bookmarkStart w:id="0" w:name="_Toc243848948"/>
       <w:r>
         <w:lastRenderedPageBreak/>
         <w:t>INTRODUCTION</w:t>
@@ -1795,7 +1772,7 @@
       <w:pPr>
         <w:pStyle w:val="Heading2"/>
       </w:pPr>
-      <w:bookmarkStart w:id="1" w:name="_Toc242734350"/>
+      <w:bookmarkStart w:id="1" w:name="_Toc243848949"/>
       <w:r>
         <w:t>Purpose of the work</w:t>
       </w:r>
@@ -1877,9 +1854,8 @@
       <w:pPr>
         <w:pStyle w:val="Heading1"/>
       </w:pPr>
-      <w:bookmarkStart w:id="2" w:name="_Toc242734351"/>
-      <w:r>
-        <w:lastRenderedPageBreak/>
+      <w:bookmarkStart w:id="2" w:name="_Toc243848950"/>
+      <w:r>
         <w:t>1 LAB 5. THE FILE SYSTEM WITH YOUR OWN HANDS</w:t>
       </w:r>
       <w:bookmarkEnd w:id="2"/>
@@ -1888,7 +1864,7 @@
       <w:pPr>
         <w:pStyle w:val="Heading2"/>
       </w:pPr>
-      <w:bookmarkStart w:id="3" w:name="_Toc242734352"/>
+      <w:bookmarkStart w:id="3" w:name="_Toc243848951"/>
       <w:r>
         <w:t>1.1 The tree and the file types</w:t>
       </w:r>
@@ -2420,7 +2396,6 @@
         <w:rPr>
           <w:noProof/>
         </w:rPr>
-        <w:lastRenderedPageBreak/>
         <w:drawing>
           <wp:inline distT="0" distB="0" distL="0" distR="0" wp14:anchorId="450B44C2" wp14:editId="340E49C2">
             <wp:extent cx="5275580" cy="2267454"/>
@@ -2553,7 +2528,7 @@
       <w:pPr>
         <w:pStyle w:val="Heading2"/>
       </w:pPr>
-      <w:bookmarkStart w:id="4" w:name="_Toc242734353"/>
+      <w:bookmarkStart w:id="4" w:name="_Toc243848952"/>
       <w:r>
         <w:t>1.2 Inodes and links</w:t>
       </w:r>
@@ -2631,7 +2606,6 @@
         <w:pStyle w:val="BodyText2026"/>
       </w:pPr>
       <w:r>
-        <w:lastRenderedPageBreak/>
         <w:t xml:space="preserve">The command </w:t>
       </w:r>
       <w:r>
@@ -2882,7 +2856,7 @@
       <w:pPr>
         <w:pStyle w:val="Heading2"/>
       </w:pPr>
-      <w:bookmarkStart w:id="5" w:name="_Toc242734354"/>
+      <w:bookmarkStart w:id="5" w:name="_Toc243848953"/>
       <w:r>
         <w:t>1.3 Answers for the inodes and links</w:t>
       </w:r>
@@ -2901,7 +2875,6 @@
         <w:pStyle w:val="BodyText2026"/>
       </w:pPr>
       <w:r>
-        <w:lastRenderedPageBreak/>
         <w:t xml:space="preserve">2. A name is only an entry in a folder that holds a file name and an inode number. rm calls the system call unlink, which removes one such entry and decreases the link count of the inode. The inode and its data blocks are freed only when the count reaches 0 and no process has the file open. After </w:t>
       </w:r>
       <w:r>
@@ -2943,7 +2916,7 @@
       <w:pPr>
         <w:pStyle w:val="Heading2"/>
       </w:pPr>
-      <w:bookmarkStart w:id="6" w:name="_Toc242734355"/>
+      <w:bookmarkStart w:id="6" w:name="_Toc243848954"/>
       <w:r>
         <w:t>1.4 Permissions</w:t>
       </w:r>
@@ -3042,7 +3015,6 @@
         <w:rPr>
           <w:noProof/>
         </w:rPr>
-        <w:lastRenderedPageBreak/>
         <w:drawing>
           <wp:inline distT="0" distB="0" distL="0" distR="0" wp14:anchorId="78145A4E" wp14:editId="2A862C14">
             <wp:extent cx="5275580" cy="1133727"/>
@@ -3165,7 +3137,7 @@
       <w:pPr>
         <w:pStyle w:val="Heading2"/>
       </w:pPr>
-      <w:bookmarkStart w:id="7" w:name="_Toc242734356"/>
+      <w:bookmarkStart w:id="7" w:name="_Toc243848955"/>
       <w:r>
         <w:t>1.5 Answers for the permissions</w:t>
       </w:r>
@@ -3477,7 +3449,6 @@
         <w:pStyle w:val="BodyText2026"/>
       </w:pPr>
       <w:r>
-        <w:lastRenderedPageBreak/>
         <w:t>5. The s in the owner bits of /usr/bin/passwd is the setuid bit: the program runs with the user ID of its owner, root, whoever starts it. passwd needs it because it changes /etc/shadow, which holds the password hashes and is not even readable for normal users. The t on /tmp is the sticky bit: everyone may create files in /tmp, but a file can be removed or renamed only by its owner (or the owner of the folder, or root), so users cannot delete each other's files.</w:t>
       </w:r>
     </w:p>
@@ -3485,7 +3456,7 @@
       <w:pPr>
         <w:pStyle w:val="Heading2"/>
       </w:pPr>
-      <w:bookmarkStart w:id="8" w:name="_Toc242734357"/>
+      <w:bookmarkStart w:id="8" w:name="_Toc243848956"/>
       <w:r>
         <w:t>1.6 Disks and the kernel as files</w:t>
       </w:r>
@@ -3584,7 +3555,6 @@
         <w:rPr>
           <w:noProof/>
         </w:rPr>
-        <w:lastRenderedPageBreak/>
         <w:drawing>
           <wp:inline distT="0" distB="0" distL="0" distR="0" wp14:anchorId="25035B57" wp14:editId="43FC7277">
             <wp:extent cx="5275580" cy="1984433"/>
@@ -3707,7 +3677,7 @@
       <w:pPr>
         <w:pStyle w:val="Heading2"/>
       </w:pPr>
-      <w:bookmarkStart w:id="9" w:name="_Toc242734358"/>
+      <w:bookmarkStart w:id="9" w:name="_Toc243848957"/>
       <w:r>
         <w:t>1.7 Answers for the disks</w:t>
       </w:r>
@@ -3752,7 +3722,6 @@
         <w:pStyle w:val="BodyText2026"/>
       </w:pPr>
       <w:r>
-        <w:lastRenderedPageBreak/>
         <w:t xml:space="preserve">4. /proc/self/status showed Name: head. /proc/self is a link to the folder of the process that reads it, and the file was read by head. In the same way </w:t>
       </w:r>
       <w:r>
@@ -3770,7 +3739,7 @@
       <w:pPr>
         <w:pStyle w:val="Heading2"/>
       </w:pPr>
-      <w:bookmarkStart w:id="10" w:name="_Toc242734359"/>
+      <w:bookmarkStart w:id="10" w:name="_Toc243848958"/>
       <w:r>
         <w:t>1.8 Optional tasks</w:t>
       </w:r>
@@ -3869,7 +3838,6 @@
         <w:rPr>
           <w:noProof/>
         </w:rPr>
-        <w:lastRenderedPageBreak/>
         <w:drawing>
           <wp:inline distT="0" distB="0" distL="0" distR="0" wp14:anchorId="5FD3A2B9" wp14:editId="05458A26">
             <wp:extent cx="5275580" cy="2409238"/>
@@ -3925,9 +3893,8 @@
       <w:pPr>
         <w:pStyle w:val="Heading1"/>
       </w:pPr>
-      <w:bookmarkStart w:id="11" w:name="_Toc242734360"/>
-      <w:r>
-        <w:lastRenderedPageBreak/>
+      <w:bookmarkStart w:id="11" w:name="_Toc243848959"/>
+      <w:r>
         <w:t>2 LAB 6. INSIDE THE XV6 FILE SYSTEM</w:t>
       </w:r>
       <w:bookmarkEnd w:id="11"/>
@@ -3936,7 +3903,7 @@
       <w:pPr>
         <w:pStyle w:val="Heading2"/>
       </w:pPr>
-      <w:bookmarkStart w:id="12" w:name="_Toc242734361"/>
+      <w:bookmarkStart w:id="12" w:name="_Toc243848960"/>
       <w:r>
         <w:t>2.1 What xv6 shows</w:t>
       </w:r>
@@ -4025,7 +3992,6 @@
         <w:rPr>
           <w:noProof/>
         </w:rPr>
-        <w:lastRenderedPageBreak/>
         <w:drawing>
           <wp:inline distT="0" distB="0" distL="0" distR="0" wp14:anchorId="772B6BBD" wp14:editId="573133E8">
             <wp:extent cx="5275580" cy="4677239"/>
@@ -4105,7 +4071,7 @@
       <w:pPr>
         <w:pStyle w:val="Heading2"/>
       </w:pPr>
-      <w:bookmarkStart w:id="13" w:name="_Toc242734362"/>
+      <w:bookmarkStart w:id="13" w:name="_Toc243848961"/>
       <w:r>
         <w:t>2.2 The program mystat</w:t>
       </w:r>
@@ -4116,11 +4082,7 @@
         <w:pStyle w:val="BodyText2026"/>
       </w:pPr>
       <w:r>
-        <w:t xml:space="preserve">The program user/mystat.c (Listing 2.1) calls stat for every argument. stat is a library function in user/ulib.c that opens the file, calls fstat on the descriptor and closes it again. typename converts the type number into a word with a switch over the constants of kernel/stat.h. If stat fails, a message goes to the descriptor 2, the error output, and the loop continues with the next argument. The size </w:t>
-      </w:r>
-      <w:r>
-        <w:lastRenderedPageBreak/>
-        <w:t xml:space="preserve">field is a 64 bit number, so it is cast to int for printf, and the program ends with exit(0), because an xv6 program cannot simply return from main. The line </w:t>
+        <w:t xml:space="preserve">The program user/mystat.c (Listing 2.1) calls stat for every argument. stat is a library function in user/ulib.c that opens the file, calls fstat on the descriptor and closes it again. typename converts the type number into a word with a switch over the constants of kernel/stat.h. If stat fails, a message goes to the descriptor 2, the error output, and the loop continues with the next argument. The size field is a 64 bit number, so it is cast to int for printf, and the program ends with exit(0), because an xv6 program cannot simply return from main. The line </w:t>
       </w:r>
       <w:r>
         <w:rPr>
@@ -4421,7 +4383,6 @@
         <w:rPr>
           <w:noProof/>
         </w:rPr>
-        <w:lastRenderedPageBreak/>
         <w:drawing>
           <wp:inline distT="0" distB="0" distL="0" distR="0" wp14:anchorId="65BB047E" wp14:editId="6361EFEC">
             <wp:extent cx="5275580" cy="1842648"/>
@@ -4611,7 +4572,6 @@
         <w:pStyle w:val="BodyText2026"/>
       </w:pPr>
       <w:r>
-        <w:lastRenderedPageBreak/>
         <w:t>3. struct dinode, the inode on the disk, has only six fields: type, major, minor (the device numbers, used only for devices), nlink, size and addrs, the addresses of the 12 direct blocks and of one indirect block. Every field is 2 or 4 bytes, so one inode takes 64 bytes and 16 inodes fit in a block. There is no owner, no mode and no time, which is why xv6 has no permissions, and there is no type for a symbolic link.</w:t>
       </w:r>
     </w:p>
@@ -4619,7 +4579,7 @@
       <w:pPr>
         <w:pStyle w:val="Heading2"/>
       </w:pPr>
-      <w:bookmarkStart w:id="14" w:name="_Toc242734363"/>
+      <w:bookmarkStart w:id="14" w:name="_Toc243848962"/>
       <w:r>
         <w:t>2.3 The limits of the file system</w:t>
       </w:r>
@@ -4784,11 +4744,7 @@
         <w:pStyle w:val="BodyText2026"/>
       </w:pPr>
       <w:r>
-        <w:t xml:space="preserve">1. ls shows averyveryveryl, the first 14 characters of the name, because a directory entry has room for only DIRSIZ = 14 characters and the kernel cuts longer names without an error. The lookup </w:t>
-      </w:r>
-      <w:r>
-        <w:lastRenderedPageBreak/>
-        <w:t>compares only the first DIRSIZ characters as well, so the folder can be opened with the full name or the cut one, and mystat finds the same inode 29 under both names.</w:t>
+        <w:t>1. ls shows averyveryveryl, the first 14 characters of the name, because a directory entry has room for only DIRSIZ = 14 characters and the kernel cuts longer names without an error. The lookup compares only the first DIRSIZ characters as well, so the folder can be opened with the full name or the cut one, and mystat finds the same inode 29 under both names.</w:t>
       </w:r>
     </w:p>
     <w:p>
@@ -5162,7 +5118,7 @@
       <w:pPr>
         <w:pStyle w:val="Heading2"/>
       </w:pPr>
-      <w:bookmarkStart w:id="15" w:name="_Toc242734364"/>
+      <w:bookmarkStart w:id="15" w:name="_Toc243848963"/>
       <w:r>
         <w:t>2.4 The program find</w:t>
       </w:r>
@@ -5181,7 +5137,6 @@
         <w:pStyle w:val="Code2026"/>
       </w:pPr>
       <w:r>
-        <w:lastRenderedPageBreak/>
         <w:t>#include "kernel/types.h"</w:t>
       </w:r>
     </w:p>
@@ -5670,7 +5625,6 @@
         <w:pStyle w:val="Code2026"/>
       </w:pPr>
       <w:r>
-        <w:lastRenderedPageBreak/>
         <w:t xml:space="preserve">    showino = 1;</w:t>
       </w:r>
     </w:p>
@@ -5926,9 +5880,8 @@
       <w:pPr>
         <w:pStyle w:val="Heading1"/>
       </w:pPr>
-      <w:bookmarkStart w:id="16" w:name="_Toc242734365"/>
-      <w:r>
-        <w:lastRenderedPageBreak/>
+      <w:bookmarkStart w:id="16" w:name="_Toc243848964"/>
+      <w:r>
         <w:t>CONCLUSIONS</w:t>
       </w:r>
       <w:bookmarkEnd w:id="16"/>
@@ -5961,9 +5914,8 @@
       <w:pPr>
         <w:pStyle w:val="Heading1"/>
       </w:pPr>
-      <w:bookmarkStart w:id="17" w:name="_Toc242734366"/>
-      <w:r>
-        <w:lastRenderedPageBreak/>
+      <w:bookmarkStart w:id="17" w:name="_Toc243848965"/>
+      <w:r>
         <w:t>REFERENCES</w:t>
       </w:r>
       <w:bookmarkEnd w:id="17"/>
@@ -6578,6 +6530,7 @@
   <w:style w:type="character" w:default="1" w:styleId="DefaultParagraphFont">
     <w:name w:val="Default Paragraph Font"/>
     <w:uiPriority w:val="1"/>
+    <w:semiHidden/>
     <w:unhideWhenUsed/>
   </w:style>
   <w:style w:type="table" w:default="1" w:styleId="TableNormal">

</xml_diff>